<commit_message>
Restore Genpact and IB Cargo as two distinct separate firm entries on CV
</commit_message>
<xml_diff>
--- a/docs/Alexandru_Mihalcea_Calinescu_CV.docx
+++ b/docs/Alexandru_Mihalcea_Calinescu_CV.docx
@@ -4,33 +4,33 @@
   <w:body>
     <w:p>
       <w:pPr>
-        <w:spacing w:before="0" w:after="40" w:line="240" w:lineRule="auto"/>
+        <w:spacing w:before="0" w:after="20" w:line="240" w:lineRule="auto"/>
         <w:jc w:val="center"/>
       </w:pPr>
       <w:r>
         <w:rPr>
           <w:rFonts w:ascii="Liberation Serif" w:hAnsi="Liberation Serif"/>
-          <w:sz w:val="44"/>
+          <w:sz w:val="42"/>
         </w:rPr>
         <w:t>Alexandru Mihalcea-Calinescu</w:t>
       </w:r>
     </w:p>
     <w:p>
       <w:pPr>
-        <w:spacing w:before="0" w:after="120" w:line="240" w:lineRule="auto"/>
+        <w:spacing w:before="0" w:after="80" w:line="240" w:lineRule="auto"/>
         <w:jc w:val="center"/>
       </w:pPr>
       <w:r>
         <w:rPr>
           <w:rFonts w:ascii="Liberation Serif" w:hAnsi="Liberation Serif"/>
-          <w:sz w:val="20"/>
+          <w:sz w:val="19"/>
         </w:rPr>
         <w:t xml:space="preserve">alex.mihalcea12@gmail.com | +40 722 237 081 | </w:t>
       </w:r>
       <w:r>
         <w:rPr>
           <w:rFonts w:ascii="Liberation Serif" w:hAnsi="Liberation Serif"/>
-          <w:sz w:val="20"/>
+          <w:sz w:val="19"/>
           <w:u w:val="single"/>
         </w:rPr>
         <w:t>LinkedIn</w:t>
@@ -39,13 +39,13 @@
     <w:p>
       <w:pPr>
         <w:keepNext/>
-        <w:spacing w:before="130" w:after="40" w:line="240" w:lineRule="auto"/>
+        <w:spacing w:before="90" w:after="30" w:line="240" w:lineRule="auto"/>
       </w:pPr>
       <w:r>
         <w:rPr>
           <w:rFonts w:ascii="Liberation Serif" w:hAnsi="Liberation Serif"/>
           <w:b/>
-          <w:sz w:val="21"/>
+          <w:sz w:val="20"/>
           <w:u w:val="single"/>
         </w:rPr>
         <w:t>EDUCATION</w:t>
@@ -59,13 +59,13 @@
         <w:tblLook w:firstColumn="1" w:firstRow="1" w:lastColumn="0" w:lastRow="0" w:noHBand="0" w:noVBand="1" w:val="04A0"/>
       </w:tblPr>
       <w:tblGrid>
-        <w:gridCol w:w="5119"/>
-        <w:gridCol w:w="5119"/>
+        <w:gridCol w:w="5162"/>
+        <w:gridCol w:w="5162"/>
       </w:tblGrid>
       <w:tr>
         <w:tc>
           <w:tcPr>
-            <w:tcW w:type="dxa" w:w="7560"/>
+            <w:tcW w:type="dxa" w:w="7632"/>
             <w:tcMar>
               <w:top w:w="0" w:type="dxa"/>
               <w:bottom w:w="0" w:type="dxa"/>
@@ -75,13 +75,13 @@
           </w:tcPr>
           <w:p>
             <w:pPr>
-              <w:spacing w:before="40" w:after="0" w:line="247" w:lineRule="auto"/>
+              <w:spacing w:before="24" w:after="0" w:line="245" w:lineRule="auto"/>
             </w:pPr>
             <w:r>
               <w:rPr>
                 <w:rFonts w:ascii="Liberation Serif" w:hAnsi="Liberation Serif"/>
                 <w:b/>
-                <w:sz w:val="21"/>
+                <w:sz w:val="20"/>
               </w:rPr>
               <w:t>Università Bocconi</w:t>
             </w:r>
@@ -89,7 +89,7 @@
         </w:tc>
         <w:tc>
           <w:tcPr>
-            <w:tcW w:type="dxa" w:w="2678"/>
+            <w:tcW w:type="dxa" w:w="2693"/>
             <w:tcMar>
               <w:top w:w="0" w:type="dxa"/>
               <w:bottom w:w="0" w:type="dxa"/>
@@ -99,14 +99,14 @@
           </w:tcPr>
           <w:p>
             <w:pPr>
-              <w:spacing w:before="40" w:after="0" w:line="247" w:lineRule="auto"/>
+              <w:spacing w:before="24" w:after="0" w:line="245" w:lineRule="auto"/>
               <w:jc w:val="right"/>
             </w:pPr>
             <w:r>
               <w:rPr>
                 <w:rFonts w:ascii="Liberation Serif" w:hAnsi="Liberation Serif"/>
                 <w:b/>
-                <w:sz w:val="21"/>
+                <w:sz w:val="20"/>
               </w:rPr>
               <w:t>Milan, Italy</w:t>
             </w:r>
@@ -116,7 +116,7 @@
       <w:tr>
         <w:tc>
           <w:tcPr>
-            <w:tcW w:type="dxa" w:w="7560"/>
+            <w:tcW w:type="dxa" w:w="7632"/>
             <w:tcMar>
               <w:top w:w="0" w:type="dxa"/>
               <w:bottom w:w="0" w:type="dxa"/>
@@ -126,13 +126,13 @@
           </w:tcPr>
           <w:p>
             <w:pPr>
-              <w:spacing w:before="0" w:after="10" w:line="247" w:lineRule="auto"/>
+              <w:spacing w:before="0" w:after="10" w:line="245" w:lineRule="auto"/>
             </w:pPr>
             <w:r>
               <w:rPr>
                 <w:rFonts w:ascii="Liberation Serif" w:hAnsi="Liberation Serif"/>
                 <w:i/>
-                <w:sz w:val="20"/>
+                <w:sz w:val="19"/>
               </w:rPr>
               <w:t>BSc in Economics, Management and Computer Science</w:t>
             </w:r>
@@ -140,7 +140,7 @@
         </w:tc>
         <w:tc>
           <w:tcPr>
-            <w:tcW w:type="dxa" w:w="2678"/>
+            <w:tcW w:type="dxa" w:w="2693"/>
             <w:tcMar>
               <w:top w:w="0" w:type="dxa"/>
               <w:bottom w:w="0" w:type="dxa"/>
@@ -150,14 +150,14 @@
           </w:tcPr>
           <w:p>
             <w:pPr>
-              <w:spacing w:before="0" w:after="10" w:line="247" w:lineRule="auto"/>
+              <w:spacing w:before="0" w:after="10" w:line="245" w:lineRule="auto"/>
               <w:jc w:val="right"/>
             </w:pPr>
             <w:r>
               <w:rPr>
                 <w:rFonts w:ascii="Liberation Serif" w:hAnsi="Liberation Serif"/>
                 <w:i w:val="0"/>
-                <w:sz w:val="20"/>
+                <w:sz w:val="19"/>
               </w:rPr>
               <w:t>Sep 2026 - Present</w:t>
             </w:r>
@@ -167,20 +167,20 @@
     </w:tbl>
     <w:p>
       <w:pPr>
-        <w:spacing w:before="0" w:after="20" w:line="250" w:lineRule="auto"/>
+        <w:spacing w:before="0" w:after="12" w:line="245" w:lineRule="auto"/>
         <w:ind w:left="346" w:hanging="202"/>
       </w:pPr>
       <w:r>
         <w:rPr>
           <w:rFonts w:ascii="Liberation Serif" w:hAnsi="Liberation Serif"/>
-          <w:sz w:val="20"/>
+          <w:sz w:val="19"/>
         </w:rPr>
         <w:t xml:space="preserve">• </w:t>
       </w:r>
       <w:r>
         <w:rPr>
           <w:rFonts w:ascii="Liberation Serif" w:hAnsi="Liberation Serif"/>
-          <w:sz w:val="20"/>
+          <w:sz w:val="19"/>
         </w:rPr>
         <w:t>Student Societies: Member of BSML (Machine Learning) and Hephaestus (Applied AI Association).</w:t>
       </w:r>
@@ -193,13 +193,13 @@
         <w:tblLook w:firstColumn="1" w:firstRow="1" w:lastColumn="0" w:lastRow="0" w:noHBand="0" w:noVBand="1" w:val="04A0"/>
       </w:tblPr>
       <w:tblGrid>
-        <w:gridCol w:w="5119"/>
-        <w:gridCol w:w="5119"/>
+        <w:gridCol w:w="5162"/>
+        <w:gridCol w:w="5162"/>
       </w:tblGrid>
       <w:tr>
         <w:tc>
           <w:tcPr>
-            <w:tcW w:type="dxa" w:w="7560"/>
+            <w:tcW w:type="dxa" w:w="7632"/>
             <w:tcMar>
               <w:top w:w="0" w:type="dxa"/>
               <w:bottom w:w="0" w:type="dxa"/>
@@ -209,13 +209,13 @@
           </w:tcPr>
           <w:p>
             <w:pPr>
-              <w:spacing w:before="40" w:after="0" w:line="247" w:lineRule="auto"/>
+              <w:spacing w:before="24" w:after="0" w:line="245" w:lineRule="auto"/>
             </w:pPr>
             <w:r>
               <w:rPr>
                 <w:rFonts w:ascii="Liberation Serif" w:hAnsi="Liberation Serif"/>
                 <w:b/>
-                <w:sz w:val="21"/>
+                <w:sz w:val="20"/>
               </w:rPr>
               <w:t>Avenor College</w:t>
             </w:r>
@@ -223,7 +223,7 @@
         </w:tc>
         <w:tc>
           <w:tcPr>
-            <w:tcW w:type="dxa" w:w="2678"/>
+            <w:tcW w:type="dxa" w:w="2693"/>
             <w:tcMar>
               <w:top w:w="0" w:type="dxa"/>
               <w:bottom w:w="0" w:type="dxa"/>
@@ -233,14 +233,14 @@
           </w:tcPr>
           <w:p>
             <w:pPr>
-              <w:spacing w:before="40" w:after="0" w:line="247" w:lineRule="auto"/>
+              <w:spacing w:before="24" w:after="0" w:line="245" w:lineRule="auto"/>
               <w:jc w:val="right"/>
             </w:pPr>
             <w:r>
               <w:rPr>
                 <w:rFonts w:ascii="Liberation Serif" w:hAnsi="Liberation Serif"/>
                 <w:b/>
-                <w:sz w:val="21"/>
+                <w:sz w:val="20"/>
               </w:rPr>
               <w:t>Bucharest, Romania</w:t>
             </w:r>
@@ -250,7 +250,7 @@
       <w:tr>
         <w:tc>
           <w:tcPr>
-            <w:tcW w:type="dxa" w:w="7560"/>
+            <w:tcW w:type="dxa" w:w="7632"/>
             <w:tcMar>
               <w:top w:w="0" w:type="dxa"/>
               <w:bottom w:w="0" w:type="dxa"/>
@@ -260,13 +260,13 @@
           </w:tcPr>
           <w:p>
             <w:pPr>
-              <w:spacing w:before="0" w:after="10" w:line="247" w:lineRule="auto"/>
+              <w:spacing w:before="0" w:after="10" w:line="245" w:lineRule="auto"/>
             </w:pPr>
             <w:r>
               <w:rPr>
                 <w:rFonts w:ascii="Liberation Serif" w:hAnsi="Liberation Serif"/>
                 <w:i/>
-                <w:sz w:val="20"/>
+                <w:sz w:val="19"/>
               </w:rPr>
               <w:t>A Levels, British Curriculum</w:t>
             </w:r>
@@ -274,7 +274,7 @@
         </w:tc>
         <w:tc>
           <w:tcPr>
-            <w:tcW w:type="dxa" w:w="2678"/>
+            <w:tcW w:type="dxa" w:w="2693"/>
             <w:tcMar>
               <w:top w:w="0" w:type="dxa"/>
               <w:bottom w:w="0" w:type="dxa"/>
@@ -284,14 +284,14 @@
           </w:tcPr>
           <w:p>
             <w:pPr>
-              <w:spacing w:before="0" w:after="10" w:line="247" w:lineRule="auto"/>
+              <w:spacing w:before="0" w:after="10" w:line="245" w:lineRule="auto"/>
               <w:jc w:val="right"/>
             </w:pPr>
             <w:r>
               <w:rPr>
                 <w:rFonts w:ascii="Liberation Serif" w:hAnsi="Liberation Serif"/>
                 <w:i w:val="0"/>
-                <w:sz w:val="20"/>
+                <w:sz w:val="19"/>
               </w:rPr>
               <w:t>Jun 2026</w:t>
             </w:r>
@@ -301,60 +301,60 @@
     </w:tbl>
     <w:p>
       <w:pPr>
-        <w:spacing w:before="0" w:after="20" w:line="250" w:lineRule="auto"/>
+        <w:spacing w:before="0" w:after="12" w:line="245" w:lineRule="auto"/>
         <w:ind w:left="346" w:hanging="202"/>
       </w:pPr>
       <w:r>
         <w:rPr>
           <w:rFonts w:ascii="Liberation Serif" w:hAnsi="Liberation Serif"/>
-          <w:sz w:val="20"/>
+          <w:sz w:val="19"/>
         </w:rPr>
         <w:t xml:space="preserve">• </w:t>
       </w:r>
       <w:r>
         <w:rPr>
           <w:rFonts w:ascii="Liberation Serif" w:hAnsi="Liberation Serif"/>
-          <w:sz w:val="20"/>
+          <w:sz w:val="19"/>
         </w:rPr>
         <w:t>Economics (A), Mathematics (A), Computer Science (A), History (A), Extended Project Qualification (A)</w:t>
       </w:r>
     </w:p>
     <w:p>
       <w:pPr>
-        <w:spacing w:before="0" w:after="20" w:line="250" w:lineRule="auto"/>
+        <w:spacing w:before="0" w:after="12" w:line="245" w:lineRule="auto"/>
         <w:ind w:left="346" w:hanging="202"/>
       </w:pPr>
       <w:r>
         <w:rPr>
           <w:rFonts w:ascii="Liberation Serif" w:hAnsi="Liberation Serif"/>
-          <w:sz w:val="20"/>
+          <w:sz w:val="19"/>
         </w:rPr>
         <w:t xml:space="preserve">• </w:t>
       </w:r>
       <w:r>
         <w:rPr>
           <w:rFonts w:ascii="Liberation Serif" w:hAnsi="Liberation Serif"/>
-          <w:sz w:val="20"/>
+          <w:sz w:val="19"/>
         </w:rPr>
         <w:t>IGCSE results: A*A*A*A*A*AAA(A)</w:t>
       </w:r>
     </w:p>
     <w:p>
       <w:pPr>
-        <w:spacing w:before="0" w:after="20" w:line="250" w:lineRule="auto"/>
+        <w:spacing w:before="0" w:after="12" w:line="245" w:lineRule="auto"/>
         <w:ind w:left="346" w:hanging="202"/>
       </w:pPr>
       <w:r>
         <w:rPr>
           <w:rFonts w:ascii="Liberation Serif" w:hAnsi="Liberation Serif"/>
-          <w:sz w:val="20"/>
+          <w:sz w:val="19"/>
         </w:rPr>
         <w:t xml:space="preserve">• </w:t>
       </w:r>
       <w:r>
         <w:rPr>
           <w:rFonts w:ascii="Liberation Serif" w:hAnsi="Liberation Serif"/>
-          <w:sz w:val="20"/>
+          <w:sz w:val="19"/>
         </w:rPr>
         <w:t>SAT: 1500, 99th percentile (800 Reading and Writing, 700 Mathematics)</w:t>
       </w:r>
@@ -362,13 +362,13 @@
     <w:p>
       <w:pPr>
         <w:keepNext/>
-        <w:spacing w:before="130" w:after="40" w:line="240" w:lineRule="auto"/>
+        <w:spacing w:before="90" w:after="30" w:line="240" w:lineRule="auto"/>
       </w:pPr>
       <w:r>
         <w:rPr>
           <w:rFonts w:ascii="Liberation Serif" w:hAnsi="Liberation Serif"/>
           <w:b/>
-          <w:sz w:val="21"/>
+          <w:sz w:val="20"/>
           <w:u w:val="single"/>
         </w:rPr>
         <w:t>AWARDS &amp; ACHIEVEMENTS</w:t>
@@ -376,13 +376,13 @@
     </w:p>
     <w:p>
       <w:pPr>
-        <w:spacing w:before="0" w:after="20" w:line="250" w:lineRule="auto"/>
+        <w:spacing w:before="0" w:after="12" w:line="245" w:lineRule="auto"/>
         <w:ind w:left="346" w:hanging="202"/>
       </w:pPr>
       <w:r>
         <w:rPr>
           <w:rFonts w:ascii="Liberation Serif" w:hAnsi="Liberation Serif"/>
-          <w:sz w:val="20"/>
+          <w:sz w:val="19"/>
         </w:rPr>
         <w:t xml:space="preserve">• </w:t>
       </w:r>
@@ -390,27 +390,27 @@
         <w:rPr>
           <w:rFonts w:ascii="Liberation Serif" w:hAnsi="Liberation Serif"/>
           <w:b/>
-          <w:sz w:val="20"/>
+          <w:sz w:val="19"/>
         </w:rPr>
         <w:t xml:space="preserve">World Economics Cup 2025: </w:t>
       </w:r>
       <w:r>
         <w:rPr>
           <w:rFonts w:ascii="Liberation Serif" w:hAnsi="Liberation Serif"/>
-          <w:sz w:val="20"/>
+          <w:sz w:val="19"/>
         </w:rPr>
         <w:t>continental top-three team and individual Silver Award at the International Final among 428 teams and 2,502 competitors from 47 countries and regions</w:t>
       </w:r>
     </w:p>
     <w:p>
       <w:pPr>
-        <w:spacing w:before="0" w:after="20" w:line="250" w:lineRule="auto"/>
+        <w:spacing w:before="0" w:after="12" w:line="245" w:lineRule="auto"/>
         <w:ind w:left="346" w:hanging="202"/>
       </w:pPr>
       <w:r>
         <w:rPr>
           <w:rFonts w:ascii="Liberation Serif" w:hAnsi="Liberation Serif"/>
-          <w:sz w:val="20"/>
+          <w:sz w:val="19"/>
         </w:rPr>
         <w:t xml:space="preserve">• </w:t>
       </w:r>
@@ -418,27 +418,27 @@
         <w:rPr>
           <w:rFonts w:ascii="Liberation Serif" w:hAnsi="Liberation Serif"/>
           <w:b/>
-          <w:sz w:val="20"/>
+          <w:sz w:val="19"/>
         </w:rPr>
         <w:t xml:space="preserve">UKMT Senior Mathematical Challenge: </w:t>
       </w:r>
       <w:r>
         <w:rPr>
           <w:rFonts w:ascii="Liberation Serif" w:hAnsi="Liberation Serif"/>
-          <w:sz w:val="20"/>
+          <w:sz w:val="19"/>
         </w:rPr>
         <w:t>Silver Award</w:t>
       </w:r>
     </w:p>
     <w:p>
       <w:pPr>
-        <w:spacing w:before="0" w:after="20" w:line="250" w:lineRule="auto"/>
+        <w:spacing w:before="0" w:after="12" w:line="245" w:lineRule="auto"/>
         <w:ind w:left="346" w:hanging="202"/>
       </w:pPr>
       <w:r>
         <w:rPr>
           <w:rFonts w:ascii="Liberation Serif" w:hAnsi="Liberation Serif"/>
-          <w:sz w:val="20"/>
+          <w:sz w:val="19"/>
         </w:rPr>
         <w:t xml:space="preserve">• </w:t>
       </w:r>
@@ -446,27 +446,27 @@
         <w:rPr>
           <w:rFonts w:ascii="Liberation Serif" w:hAnsi="Liberation Serif"/>
           <w:b/>
-          <w:sz w:val="20"/>
+          <w:sz w:val="19"/>
         </w:rPr>
         <w:t xml:space="preserve">Duke of Edinburgh's International Award: </w:t>
       </w:r>
       <w:r>
         <w:rPr>
           <w:rFonts w:ascii="Liberation Serif" w:hAnsi="Liberation Serif"/>
-          <w:sz w:val="20"/>
+          <w:sz w:val="19"/>
         </w:rPr>
         <w:t>Silver and Bronze</w:t>
       </w:r>
     </w:p>
     <w:p>
       <w:pPr>
-        <w:spacing w:before="0" w:after="20" w:line="250" w:lineRule="auto"/>
+        <w:spacing w:before="0" w:after="12" w:line="245" w:lineRule="auto"/>
         <w:ind w:left="346" w:hanging="202"/>
       </w:pPr>
       <w:r>
         <w:rPr>
           <w:rFonts w:ascii="Liberation Serif" w:hAnsi="Liberation Serif"/>
-          <w:sz w:val="20"/>
+          <w:sz w:val="19"/>
         </w:rPr>
         <w:t xml:space="preserve">• </w:t>
       </w:r>
@@ -474,14 +474,14 @@
         <w:rPr>
           <w:rFonts w:ascii="Liberation Serif" w:hAnsi="Liberation Serif"/>
           <w:b/>
-          <w:sz w:val="20"/>
+          <w:sz w:val="19"/>
         </w:rPr>
         <w:t xml:space="preserve">Academic Honour Roll: </w:t>
       </w:r>
       <w:r>
         <w:rPr>
           <w:rFonts w:ascii="Liberation Serif" w:hAnsi="Liberation Serif"/>
-          <w:sz w:val="20"/>
+          <w:sz w:val="19"/>
         </w:rPr>
         <w:t>4+ years</w:t>
       </w:r>
@@ -489,13 +489,13 @@
     <w:p>
       <w:pPr>
         <w:keepNext/>
-        <w:spacing w:before="130" w:after="40" w:line="240" w:lineRule="auto"/>
+        <w:spacing w:before="90" w:after="30" w:line="240" w:lineRule="auto"/>
       </w:pPr>
       <w:r>
         <w:rPr>
           <w:rFonts w:ascii="Liberation Serif" w:hAnsi="Liberation Serif"/>
           <w:b/>
-          <w:sz w:val="21"/>
+          <w:sz w:val="20"/>
           <w:u w:val="single"/>
         </w:rPr>
         <w:t>WORK EXPERIENCE &amp; PROJECTS</w:t>
@@ -509,13 +509,13 @@
         <w:tblLook w:firstColumn="1" w:firstRow="1" w:lastColumn="0" w:lastRow="0" w:noHBand="0" w:noVBand="1" w:val="04A0"/>
       </w:tblPr>
       <w:tblGrid>
-        <w:gridCol w:w="5119"/>
-        <w:gridCol w:w="5119"/>
+        <w:gridCol w:w="5162"/>
+        <w:gridCol w:w="5162"/>
       </w:tblGrid>
       <w:tr>
         <w:tc>
           <w:tcPr>
-            <w:tcW w:type="dxa" w:w="7560"/>
+            <w:tcW w:type="dxa" w:w="7632"/>
             <w:tcMar>
               <w:top w:w="0" w:type="dxa"/>
               <w:bottom w:w="0" w:type="dxa"/>
@@ -525,13 +525,13 @@
           </w:tcPr>
           <w:p>
             <w:pPr>
-              <w:spacing w:before="40" w:after="0" w:line="247" w:lineRule="auto"/>
+              <w:spacing w:before="24" w:after="0" w:line="245" w:lineRule="auto"/>
             </w:pPr>
             <w:r>
               <w:rPr>
                 <w:rFonts w:ascii="Liberation Serif" w:hAnsi="Liberation Serif"/>
                 <w:b/>
-                <w:sz w:val="21"/>
+                <w:sz w:val="20"/>
               </w:rPr>
               <w:t>PwC Romania</w:t>
             </w:r>
@@ -539,7 +539,7 @@
         </w:tc>
         <w:tc>
           <w:tcPr>
-            <w:tcW w:type="dxa" w:w="2678"/>
+            <w:tcW w:type="dxa" w:w="2693"/>
             <w:tcMar>
               <w:top w:w="0" w:type="dxa"/>
               <w:bottom w:w="0" w:type="dxa"/>
@@ -549,14 +549,14 @@
           </w:tcPr>
           <w:p>
             <w:pPr>
-              <w:spacing w:before="40" w:after="0" w:line="247" w:lineRule="auto"/>
+              <w:spacing w:before="24" w:after="0" w:line="245" w:lineRule="auto"/>
               <w:jc w:val="right"/>
             </w:pPr>
             <w:r>
               <w:rPr>
                 <w:rFonts w:ascii="Liberation Serif" w:hAnsi="Liberation Serif"/>
                 <w:b/>
-                <w:sz w:val="21"/>
+                <w:sz w:val="20"/>
               </w:rPr>
               <w:t>Bucharest, Romania</w:t>
             </w:r>
@@ -566,7 +566,7 @@
       <w:tr>
         <w:tc>
           <w:tcPr>
-            <w:tcW w:type="dxa" w:w="7560"/>
+            <w:tcW w:type="dxa" w:w="7632"/>
             <w:tcMar>
               <w:top w:w="0" w:type="dxa"/>
               <w:bottom w:w="0" w:type="dxa"/>
@@ -576,13 +576,13 @@
           </w:tcPr>
           <w:p>
             <w:pPr>
-              <w:spacing w:before="0" w:after="10" w:line="247" w:lineRule="auto"/>
+              <w:spacing w:before="0" w:after="10" w:line="245" w:lineRule="auto"/>
             </w:pPr>
             <w:r>
               <w:rPr>
                 <w:rFonts w:ascii="Liberation Serif" w:hAnsi="Liberation Serif"/>
                 <w:i/>
-                <w:sz w:val="20"/>
+                <w:sz w:val="19"/>
               </w:rPr>
               <w:t>M&amp;A Intern - Corporate Finance</w:t>
             </w:r>
@@ -590,7 +590,7 @@
         </w:tc>
         <w:tc>
           <w:tcPr>
-            <w:tcW w:type="dxa" w:w="2678"/>
+            <w:tcW w:type="dxa" w:w="2693"/>
             <w:tcMar>
               <w:top w:w="0" w:type="dxa"/>
               <w:bottom w:w="0" w:type="dxa"/>
@@ -600,14 +600,14 @@
           </w:tcPr>
           <w:p>
             <w:pPr>
-              <w:spacing w:before="0" w:after="10" w:line="247" w:lineRule="auto"/>
+              <w:spacing w:before="0" w:after="10" w:line="245" w:lineRule="auto"/>
               <w:jc w:val="right"/>
             </w:pPr>
             <w:r>
               <w:rPr>
                 <w:rFonts w:ascii="Liberation Serif" w:hAnsi="Liberation Serif"/>
                 <w:i w:val="0"/>
-                <w:sz w:val="20"/>
+                <w:sz w:val="19"/>
               </w:rPr>
               <w:t>Oct 2025</w:t>
             </w:r>
@@ -617,40 +617,40 @@
     </w:tbl>
     <w:p>
       <w:pPr>
-        <w:spacing w:before="0" w:after="20" w:line="250" w:lineRule="auto"/>
+        <w:spacing w:before="0" w:after="12" w:line="245" w:lineRule="auto"/>
         <w:ind w:left="346" w:hanging="202"/>
       </w:pPr>
       <w:r>
         <w:rPr>
           <w:rFonts w:ascii="Liberation Serif" w:hAnsi="Liberation Serif"/>
-          <w:sz w:val="20"/>
+          <w:sz w:val="19"/>
         </w:rPr>
         <w:t xml:space="preserve">• </w:t>
       </w:r>
       <w:r>
         <w:rPr>
           <w:rFonts w:ascii="Liberation Serif" w:hAnsi="Liberation Serif"/>
-          <w:sz w:val="20"/>
+          <w:sz w:val="19"/>
         </w:rPr>
         <w:t>Researched 20+ companies across multiple industries, examining business models, market positioning and financial performance</w:t>
       </w:r>
     </w:p>
     <w:p>
       <w:pPr>
-        <w:spacing w:before="0" w:after="20" w:line="250" w:lineRule="auto"/>
+        <w:spacing w:before="0" w:after="12" w:line="245" w:lineRule="auto"/>
         <w:ind w:left="346" w:hanging="202"/>
       </w:pPr>
       <w:r>
         <w:rPr>
           <w:rFonts w:ascii="Liberation Serif" w:hAnsi="Liberation Serif"/>
-          <w:sz w:val="20"/>
+          <w:sz w:val="19"/>
         </w:rPr>
         <w:t xml:space="preserve">• </w:t>
       </w:r>
       <w:r>
         <w:rPr>
           <w:rFonts w:ascii="Liberation Serif" w:hAnsi="Liberation Serif"/>
-          <w:sz w:val="20"/>
+          <w:sz w:val="19"/>
         </w:rPr>
         <w:t>Synthesised company research and analysis of trading comparables, precedent transaction multiples, historical trading data and financial statements into PowerPoint presentations for senior Corporate Finance team members</w:t>
       </w:r>
@@ -663,13 +663,13 @@
         <w:tblLook w:firstColumn="1" w:firstRow="1" w:lastColumn="0" w:lastRow="0" w:noHBand="0" w:noVBand="1" w:val="04A0"/>
       </w:tblPr>
       <w:tblGrid>
-        <w:gridCol w:w="5119"/>
-        <w:gridCol w:w="5119"/>
+        <w:gridCol w:w="5162"/>
+        <w:gridCol w:w="5162"/>
       </w:tblGrid>
       <w:tr>
         <w:tc>
           <w:tcPr>
-            <w:tcW w:type="dxa" w:w="7560"/>
+            <w:tcW w:type="dxa" w:w="7632"/>
             <w:tcMar>
               <w:top w:w="0" w:type="dxa"/>
               <w:bottom w:w="0" w:type="dxa"/>
@@ -679,13 +679,13 @@
           </w:tcPr>
           <w:p>
             <w:pPr>
-              <w:spacing w:before="40" w:after="0" w:line="247" w:lineRule="auto"/>
+              <w:spacing w:before="24" w:after="0" w:line="245" w:lineRule="auto"/>
             </w:pPr>
             <w:r>
               <w:rPr>
                 <w:rFonts w:ascii="Liberation Serif" w:hAnsi="Liberation Serif"/>
                 <w:b/>
-                <w:sz w:val="21"/>
+                <w:sz w:val="20"/>
               </w:rPr>
               <w:t>BAINSA Hackathon 2026</w:t>
             </w:r>
@@ -693,7 +693,7 @@
         </w:tc>
         <w:tc>
           <w:tcPr>
-            <w:tcW w:type="dxa" w:w="2678"/>
+            <w:tcW w:type="dxa" w:w="2693"/>
             <w:tcMar>
               <w:top w:w="0" w:type="dxa"/>
               <w:bottom w:w="0" w:type="dxa"/>
@@ -703,14 +703,14 @@
           </w:tcPr>
           <w:p>
             <w:pPr>
-              <w:spacing w:before="40" w:after="0" w:line="247" w:lineRule="auto"/>
+              <w:spacing w:before="24" w:after="0" w:line="245" w:lineRule="auto"/>
               <w:jc w:val="right"/>
             </w:pPr>
             <w:r>
               <w:rPr>
                 <w:rFonts w:ascii="Liberation Serif" w:hAnsi="Liberation Serif"/>
                 <w:b/>
-                <w:sz w:val="21"/>
+                <w:sz w:val="20"/>
               </w:rPr>
               <w:t>Milan, Italy</w:t>
             </w:r>
@@ -720,7 +720,7 @@
       <w:tr>
         <w:tc>
           <w:tcPr>
-            <w:tcW w:type="dxa" w:w="7560"/>
+            <w:tcW w:type="dxa" w:w="7632"/>
             <w:tcMar>
               <w:top w:w="0" w:type="dxa"/>
               <w:bottom w:w="0" w:type="dxa"/>
@@ -730,13 +730,13 @@
           </w:tcPr>
           <w:p>
             <w:pPr>
-              <w:spacing w:before="0" w:after="10" w:line="247" w:lineRule="auto"/>
+              <w:spacing w:before="0" w:after="10" w:line="245" w:lineRule="auto"/>
             </w:pPr>
             <w:r>
               <w:rPr>
                 <w:rFonts w:ascii="Liberation Serif" w:hAnsi="Liberation Serif"/>
                 <w:i/>
-                <w:sz w:val="20"/>
+                <w:sz w:val="19"/>
               </w:rPr>
               <w:t>FocusAid - Applied AI &amp; Full-Stack Contributor</w:t>
             </w:r>
@@ -744,7 +744,7 @@
         </w:tc>
         <w:tc>
           <w:tcPr>
-            <w:tcW w:type="dxa" w:w="2678"/>
+            <w:tcW w:type="dxa" w:w="2693"/>
             <w:tcMar>
               <w:top w:w="0" w:type="dxa"/>
               <w:bottom w:w="0" w:type="dxa"/>
@@ -754,14 +754,14 @@
           </w:tcPr>
           <w:p>
             <w:pPr>
-              <w:spacing w:before="0" w:after="10" w:line="247" w:lineRule="auto"/>
+              <w:spacing w:before="0" w:after="10" w:line="245" w:lineRule="auto"/>
               <w:jc w:val="right"/>
             </w:pPr>
             <w:r>
               <w:rPr>
                 <w:rFonts w:ascii="Liberation Serif" w:hAnsi="Liberation Serif"/>
                 <w:i w:val="0"/>
-                <w:sz w:val="20"/>
+                <w:sz w:val="19"/>
               </w:rPr>
               <w:t>Sep 2026</w:t>
             </w:r>
@@ -771,40 +771,40 @@
     </w:tbl>
     <w:p>
       <w:pPr>
-        <w:spacing w:before="0" w:after="20" w:line="250" w:lineRule="auto"/>
+        <w:spacing w:before="0" w:after="12" w:line="245" w:lineRule="auto"/>
         <w:ind w:left="346" w:hanging="202"/>
       </w:pPr>
       <w:r>
         <w:rPr>
           <w:rFonts w:ascii="Liberation Serif" w:hAnsi="Liberation Serif"/>
-          <w:sz w:val="20"/>
+          <w:sz w:val="19"/>
         </w:rPr>
         <w:t xml:space="preserve">• </w:t>
       </w:r>
       <w:r>
         <w:rPr>
           <w:rFonts w:ascii="Liberation Serif" w:hAnsi="Liberation Serif"/>
-          <w:sz w:val="20"/>
+          <w:sz w:val="19"/>
         </w:rPr>
         <w:t>Engineered an AI accessibility web app for neurodivergent students with real-time lecture catch-up and AI summaries</w:t>
       </w:r>
     </w:p>
     <w:p>
       <w:pPr>
-        <w:spacing w:before="0" w:after="20" w:line="250" w:lineRule="auto"/>
+        <w:spacing w:before="0" w:after="12" w:line="245" w:lineRule="auto"/>
         <w:ind w:left="346" w:hanging="202"/>
       </w:pPr>
       <w:r>
         <w:rPr>
           <w:rFonts w:ascii="Liberation Serif" w:hAnsi="Liberation Serif"/>
-          <w:sz w:val="20"/>
+          <w:sz w:val="19"/>
         </w:rPr>
         <w:t xml:space="preserve">• </w:t>
       </w:r>
       <w:r>
         <w:rPr>
           <w:rFonts w:ascii="Liberation Serif" w:hAnsi="Liberation Serif"/>
-          <w:sz w:val="20"/>
+          <w:sz w:val="19"/>
         </w:rPr>
         <w:t>Integrated private client-side attention tracking via MediaPipe and on-device WebGPU LLM inference</w:t>
       </w:r>
@@ -817,13 +817,13 @@
         <w:tblLook w:firstColumn="1" w:firstRow="1" w:lastColumn="0" w:lastRow="0" w:noHBand="0" w:noVBand="1" w:val="04A0"/>
       </w:tblPr>
       <w:tblGrid>
-        <w:gridCol w:w="5119"/>
-        <w:gridCol w:w="5119"/>
+        <w:gridCol w:w="5162"/>
+        <w:gridCol w:w="5162"/>
       </w:tblGrid>
       <w:tr>
         <w:tc>
           <w:tcPr>
-            <w:tcW w:type="dxa" w:w="7560"/>
+            <w:tcW w:type="dxa" w:w="7632"/>
             <w:tcMar>
               <w:top w:w="0" w:type="dxa"/>
               <w:bottom w:w="0" w:type="dxa"/>
@@ -833,21 +833,21 @@
           </w:tcPr>
           <w:p>
             <w:pPr>
-              <w:spacing w:before="40" w:after="0" w:line="247" w:lineRule="auto"/>
+              <w:spacing w:before="24" w:after="0" w:line="245" w:lineRule="auto"/>
             </w:pPr>
             <w:r>
               <w:rPr>
                 <w:rFonts w:ascii="Liberation Serif" w:hAnsi="Liberation Serif"/>
                 <w:b/>
-                <w:sz w:val="21"/>
+                <w:sz w:val="20"/>
               </w:rPr>
-              <w:t>Genpact &amp; IB Cargo</w:t>
+              <w:t>Genpact</w:t>
             </w:r>
           </w:p>
         </w:tc>
         <w:tc>
           <w:tcPr>
-            <w:tcW w:type="dxa" w:w="2678"/>
+            <w:tcW w:type="dxa" w:w="2693"/>
             <w:tcMar>
               <w:top w:w="0" w:type="dxa"/>
               <w:bottom w:w="0" w:type="dxa"/>
@@ -857,14 +857,14 @@
           </w:tcPr>
           <w:p>
             <w:pPr>
-              <w:spacing w:before="40" w:after="0" w:line="247" w:lineRule="auto"/>
+              <w:spacing w:before="24" w:after="0" w:line="245" w:lineRule="auto"/>
               <w:jc w:val="right"/>
             </w:pPr>
             <w:r>
               <w:rPr>
                 <w:rFonts w:ascii="Liberation Serif" w:hAnsi="Liberation Serif"/>
                 <w:b/>
-                <w:sz w:val="21"/>
+                <w:sz w:val="20"/>
               </w:rPr>
               <w:t>Bucharest, Romania</w:t>
             </w:r>
@@ -874,7 +874,7 @@
       <w:tr>
         <w:tc>
           <w:tcPr>
-            <w:tcW w:type="dxa" w:w="7560"/>
+            <w:tcW w:type="dxa" w:w="7632"/>
             <w:tcMar>
               <w:top w:w="0" w:type="dxa"/>
               <w:bottom w:w="0" w:type="dxa"/>
@@ -884,21 +884,21 @@
           </w:tcPr>
           <w:p>
             <w:pPr>
-              <w:spacing w:before="0" w:after="10" w:line="247" w:lineRule="auto"/>
+              <w:spacing w:before="0" w:after="10" w:line="245" w:lineRule="auto"/>
             </w:pPr>
             <w:r>
               <w:rPr>
                 <w:rFonts w:ascii="Liberation Serif" w:hAnsi="Liberation Serif"/>
                 <w:i/>
-                <w:sz w:val="20"/>
+                <w:sz w:val="19"/>
               </w:rPr>
-              <w:t>Operations &amp; Logistics Insight Programmes</w:t>
+              <w:t>Operations Insight Programme</w:t>
             </w:r>
           </w:p>
         </w:tc>
         <w:tc>
           <w:tcPr>
-            <w:tcW w:type="dxa" w:w="2678"/>
+            <w:tcW w:type="dxa" w:w="2693"/>
             <w:tcMar>
               <w:top w:w="0" w:type="dxa"/>
               <w:bottom w:w="0" w:type="dxa"/>
@@ -908,16 +908,16 @@
           </w:tcPr>
           <w:p>
             <w:pPr>
-              <w:spacing w:before="0" w:after="10" w:line="247" w:lineRule="auto"/>
+              <w:spacing w:before="0" w:after="10" w:line="245" w:lineRule="auto"/>
               <w:jc w:val="right"/>
             </w:pPr>
             <w:r>
               <w:rPr>
                 <w:rFonts w:ascii="Liberation Serif" w:hAnsi="Liberation Serif"/>
                 <w:i w:val="0"/>
-                <w:sz w:val="20"/>
+                <w:sz w:val="19"/>
               </w:rPr>
-              <w:t>Jun 2024 - Jun 2025</w:t>
+              <w:t>Jun 2025</w:t>
             </w:r>
           </w:p>
         </w:tc>
@@ -925,22 +925,22 @@
     </w:tbl>
     <w:p>
       <w:pPr>
-        <w:spacing w:before="0" w:after="20" w:line="250" w:lineRule="auto"/>
+        <w:spacing w:before="0" w:after="12" w:line="245" w:lineRule="auto"/>
         <w:ind w:left="346" w:hanging="202"/>
       </w:pPr>
       <w:r>
         <w:rPr>
           <w:rFonts w:ascii="Liberation Serif" w:hAnsi="Liberation Serif"/>
-          <w:sz w:val="20"/>
+          <w:sz w:val="19"/>
         </w:rPr>
         <w:t xml:space="preserve">• </w:t>
       </w:r>
       <w:r>
         <w:rPr>
           <w:rFonts w:ascii="Liberation Serif" w:hAnsi="Liberation Serif"/>
-          <w:sz w:val="20"/>
+          <w:sz w:val="19"/>
         </w:rPr>
-        <w:t>Reviewed operational workflows across order-to-cash, accounts payable, payroll, contract administration, and international supply-chain logistics through cross-departmental sessions with senior leaders</w:t>
+        <w:t>Reviewed workflows across order-to-cash, accounts payable, payroll, contract administration and vendor management through sessions with senior operations leaders</w:t>
       </w:r>
     </w:p>
     <w:tbl>
@@ -951,13 +951,13 @@
         <w:tblLook w:firstColumn="1" w:firstRow="1" w:lastColumn="0" w:lastRow="0" w:noHBand="0" w:noVBand="1" w:val="04A0"/>
       </w:tblPr>
       <w:tblGrid>
-        <w:gridCol w:w="5119"/>
-        <w:gridCol w:w="5119"/>
+        <w:gridCol w:w="5162"/>
+        <w:gridCol w:w="5162"/>
       </w:tblGrid>
       <w:tr>
         <w:tc>
           <w:tcPr>
-            <w:tcW w:type="dxa" w:w="7560"/>
+            <w:tcW w:type="dxa" w:w="7632"/>
             <w:tcMar>
               <w:top w:w="0" w:type="dxa"/>
               <w:bottom w:w="0" w:type="dxa"/>
@@ -967,21 +967,21 @@
           </w:tcPr>
           <w:p>
             <w:pPr>
-              <w:spacing w:before="40" w:after="0" w:line="247" w:lineRule="auto"/>
+              <w:spacing w:before="24" w:after="0" w:line="245" w:lineRule="auto"/>
             </w:pPr>
             <w:r>
               <w:rPr>
                 <w:rFonts w:ascii="Liberation Serif" w:hAnsi="Liberation Serif"/>
                 <w:b/>
-                <w:sz w:val="21"/>
+                <w:sz w:val="20"/>
               </w:rPr>
-              <w:t>Eau de Web</w:t>
+              <w:t>IB Cargo</w:t>
             </w:r>
           </w:p>
         </w:tc>
         <w:tc>
           <w:tcPr>
-            <w:tcW w:type="dxa" w:w="2678"/>
+            <w:tcW w:type="dxa" w:w="2693"/>
             <w:tcMar>
               <w:top w:w="0" w:type="dxa"/>
               <w:bottom w:w="0" w:type="dxa"/>
@@ -991,14 +991,14 @@
           </w:tcPr>
           <w:p>
             <w:pPr>
-              <w:spacing w:before="40" w:after="0" w:line="247" w:lineRule="auto"/>
+              <w:spacing w:before="24" w:after="0" w:line="245" w:lineRule="auto"/>
               <w:jc w:val="right"/>
             </w:pPr>
             <w:r>
               <w:rPr>
                 <w:rFonts w:ascii="Liberation Serif" w:hAnsi="Liberation Serif"/>
                 <w:b/>
-                <w:sz w:val="21"/>
+                <w:sz w:val="20"/>
               </w:rPr>
               <w:t>Bucharest, Romania</w:t>
             </w:r>
@@ -1008,7 +1008,7 @@
       <w:tr>
         <w:tc>
           <w:tcPr>
-            <w:tcW w:type="dxa" w:w="7560"/>
+            <w:tcW w:type="dxa" w:w="7632"/>
             <w:tcMar>
               <w:top w:w="0" w:type="dxa"/>
               <w:bottom w:w="0" w:type="dxa"/>
@@ -1018,21 +1018,21 @@
           </w:tcPr>
           <w:p>
             <w:pPr>
-              <w:spacing w:before="0" w:after="10" w:line="247" w:lineRule="auto"/>
+              <w:spacing w:before="0" w:after="10" w:line="245" w:lineRule="auto"/>
             </w:pPr>
             <w:r>
               <w:rPr>
                 <w:rFonts w:ascii="Liberation Serif" w:hAnsi="Liberation Serif"/>
                 <w:i/>
-                <w:sz w:val="20"/>
+                <w:sz w:val="19"/>
               </w:rPr>
-              <w:t>Summer Intern - Software Development</w:t>
+              <w:t>Transportation and Logistics Insight Programme</w:t>
             </w:r>
           </w:p>
         </w:tc>
         <w:tc>
           <w:tcPr>
-            <w:tcW w:type="dxa" w:w="2678"/>
+            <w:tcW w:type="dxa" w:w="2693"/>
             <w:tcMar>
               <w:top w:w="0" w:type="dxa"/>
               <w:bottom w:w="0" w:type="dxa"/>
@@ -1042,14 +1042,148 @@
           </w:tcPr>
           <w:p>
             <w:pPr>
-              <w:spacing w:before="0" w:after="10" w:line="247" w:lineRule="auto"/>
+              <w:spacing w:before="0" w:after="10" w:line="245" w:lineRule="auto"/>
               <w:jc w:val="right"/>
             </w:pPr>
             <w:r>
               <w:rPr>
                 <w:rFonts w:ascii="Liberation Serif" w:hAnsi="Liberation Serif"/>
                 <w:i w:val="0"/>
+                <w:sz w:val="19"/>
+              </w:rPr>
+              <w:t>Jun 2024</w:t>
+            </w:r>
+          </w:p>
+        </w:tc>
+      </w:tr>
+    </w:tbl>
+    <w:p>
+      <w:pPr>
+        <w:spacing w:before="0" w:after="12" w:line="245" w:lineRule="auto"/>
+        <w:ind w:left="346" w:hanging="202"/>
+      </w:pPr>
+      <w:r>
+        <w:rPr>
+          <w:rFonts w:ascii="Liberation Serif" w:hAnsi="Liberation Serif"/>
+          <w:sz w:val="19"/>
+        </w:rPr>
+        <w:t xml:space="preserve">• </w:t>
+      </w:r>
+      <w:r>
+        <w:rPr>
+          <w:rFonts w:ascii="Liberation Serif" w:hAnsi="Liberation Serif"/>
+          <w:sz w:val="19"/>
+        </w:rPr>
+        <w:t>Reviewed transportation and supply-chain workflows through cross-departmental sessions covering operational challenges and logistics coordination</w:t>
+      </w:r>
+    </w:p>
+    <w:tbl>
+      <w:tblPr>
+        <w:tblW w:type="auto" w:w="0"/>
+        <w:jc w:val="center"/>
+        <w:tblLayout w:type="fixed"/>
+        <w:tblLook w:firstColumn="1" w:firstRow="1" w:lastColumn="0" w:lastRow="0" w:noHBand="0" w:noVBand="1" w:val="04A0"/>
+      </w:tblPr>
+      <w:tblGrid>
+        <w:gridCol w:w="5162"/>
+        <w:gridCol w:w="5162"/>
+      </w:tblGrid>
+      <w:tr>
+        <w:tc>
+          <w:tcPr>
+            <w:tcW w:type="dxa" w:w="7632"/>
+            <w:tcMar>
+              <w:top w:w="0" w:type="dxa"/>
+              <w:bottom w:w="0" w:type="dxa"/>
+              <w:left w:w="0" w:type="dxa"/>
+              <w:right w:w="0" w:type="dxa"/>
+            </w:tcMar>
+          </w:tcPr>
+          <w:p>
+            <w:pPr>
+              <w:spacing w:before="24" w:after="0" w:line="245" w:lineRule="auto"/>
+            </w:pPr>
+            <w:r>
+              <w:rPr>
+                <w:rFonts w:ascii="Liberation Serif" w:hAnsi="Liberation Serif"/>
+                <w:b/>
                 <w:sz w:val="20"/>
+              </w:rPr>
+              <w:t>Eau de Web</w:t>
+            </w:r>
+          </w:p>
+        </w:tc>
+        <w:tc>
+          <w:tcPr>
+            <w:tcW w:type="dxa" w:w="2693"/>
+            <w:tcMar>
+              <w:top w:w="0" w:type="dxa"/>
+              <w:bottom w:w="0" w:type="dxa"/>
+              <w:left w:w="0" w:type="dxa"/>
+              <w:right w:w="0" w:type="dxa"/>
+            </w:tcMar>
+          </w:tcPr>
+          <w:p>
+            <w:pPr>
+              <w:spacing w:before="24" w:after="0" w:line="245" w:lineRule="auto"/>
+              <w:jc w:val="right"/>
+            </w:pPr>
+            <w:r>
+              <w:rPr>
+                <w:rFonts w:ascii="Liberation Serif" w:hAnsi="Liberation Serif"/>
+                <w:b/>
+                <w:sz w:val="20"/>
+              </w:rPr>
+              <w:t>Bucharest, Romania</w:t>
+            </w:r>
+          </w:p>
+        </w:tc>
+      </w:tr>
+      <w:tr>
+        <w:tc>
+          <w:tcPr>
+            <w:tcW w:type="dxa" w:w="7632"/>
+            <w:tcMar>
+              <w:top w:w="0" w:type="dxa"/>
+              <w:bottom w:w="0" w:type="dxa"/>
+              <w:left w:w="0" w:type="dxa"/>
+              <w:right w:w="0" w:type="dxa"/>
+            </w:tcMar>
+          </w:tcPr>
+          <w:p>
+            <w:pPr>
+              <w:spacing w:before="0" w:after="10" w:line="245" w:lineRule="auto"/>
+            </w:pPr>
+            <w:r>
+              <w:rPr>
+                <w:rFonts w:ascii="Liberation Serif" w:hAnsi="Liberation Serif"/>
+                <w:i/>
+                <w:sz w:val="19"/>
+              </w:rPr>
+              <w:t>Summer Intern - Software Development</w:t>
+            </w:r>
+          </w:p>
+        </w:tc>
+        <w:tc>
+          <w:tcPr>
+            <w:tcW w:type="dxa" w:w="2693"/>
+            <w:tcMar>
+              <w:top w:w="0" w:type="dxa"/>
+              <w:bottom w:w="0" w:type="dxa"/>
+              <w:left w:w="0" w:type="dxa"/>
+              <w:right w:w="0" w:type="dxa"/>
+            </w:tcMar>
+          </w:tcPr>
+          <w:p>
+            <w:pPr>
+              <w:spacing w:before="0" w:after="10" w:line="245" w:lineRule="auto"/>
+              <w:jc w:val="right"/>
+            </w:pPr>
+            <w:r>
+              <w:rPr>
+                <w:rFonts w:ascii="Liberation Serif" w:hAnsi="Liberation Serif"/>
+                <w:i w:val="0"/>
+                <w:sz w:val="19"/>
               </w:rPr>
               <w:t>Jun 2023</w:t>
             </w:r>
@@ -1059,20 +1193,20 @@
     </w:tbl>
     <w:p>
       <w:pPr>
-        <w:spacing w:before="0" w:after="20" w:line="250" w:lineRule="auto"/>
+        <w:spacing w:before="0" w:after="12" w:line="245" w:lineRule="auto"/>
         <w:ind w:left="346" w:hanging="202"/>
       </w:pPr>
       <w:r>
         <w:rPr>
           <w:rFonts w:ascii="Liberation Serif" w:hAnsi="Liberation Serif"/>
-          <w:sz w:val="20"/>
+          <w:sz w:val="19"/>
         </w:rPr>
         <w:t xml:space="preserve">• </w:t>
       </w:r>
       <w:r>
         <w:rPr>
           <w:rFonts w:ascii="Liberation Serif" w:hAnsi="Liberation Serif"/>
-          <w:sz w:val="20"/>
+          <w:sz w:val="19"/>
         </w:rPr>
         <w:t>Contributed to front-end development of a university-advisory platform, implementing UI components using HTML and CSS</w:t>
       </w:r>
@@ -1080,13 +1214,13 @@
     <w:p>
       <w:pPr>
         <w:keepNext/>
-        <w:spacing w:before="130" w:after="40" w:line="240" w:lineRule="auto"/>
+        <w:spacing w:before="90" w:after="30" w:line="240" w:lineRule="auto"/>
       </w:pPr>
       <w:r>
         <w:rPr>
           <w:rFonts w:ascii="Liberation Serif" w:hAnsi="Liberation Serif"/>
           <w:b/>
-          <w:sz w:val="21"/>
+          <w:sz w:val="20"/>
           <w:u w:val="single"/>
         </w:rPr>
         <w:t>EXTRACURRICULAR ACTIVITIES</w:t>
@@ -1100,13 +1234,13 @@
         <w:tblLook w:firstColumn="1" w:firstRow="1" w:lastColumn="0" w:lastRow="0" w:noHBand="0" w:noVBand="1" w:val="04A0"/>
       </w:tblPr>
       <w:tblGrid>
-        <w:gridCol w:w="5119"/>
-        <w:gridCol w:w="5119"/>
+        <w:gridCol w:w="5162"/>
+        <w:gridCol w:w="5162"/>
       </w:tblGrid>
       <w:tr>
         <w:tc>
           <w:tcPr>
-            <w:tcW w:type="dxa" w:w="7560"/>
+            <w:tcW w:type="dxa" w:w="7632"/>
             <w:tcMar>
               <w:top w:w="0" w:type="dxa"/>
               <w:bottom w:w="0" w:type="dxa"/>
@@ -1116,13 +1250,13 @@
           </w:tcPr>
           <w:p>
             <w:pPr>
-              <w:spacing w:before="40" w:after="0" w:line="247" w:lineRule="auto"/>
+              <w:spacing w:before="24" w:after="0" w:line="245" w:lineRule="auto"/>
             </w:pPr>
             <w:r>
               <w:rPr>
                 <w:rFonts w:ascii="Liberation Serif" w:hAnsi="Liberation Serif"/>
                 <w:b/>
-                <w:sz w:val="21"/>
+                <w:sz w:val="20"/>
               </w:rPr>
               <w:t>Christmas Fair Organisation Team</w:t>
             </w:r>
@@ -1130,7 +1264,7 @@
         </w:tc>
         <w:tc>
           <w:tcPr>
-            <w:tcW w:type="dxa" w:w="2678"/>
+            <w:tcW w:type="dxa" w:w="2693"/>
             <w:tcMar>
               <w:top w:w="0" w:type="dxa"/>
               <w:bottom w:w="0" w:type="dxa"/>
@@ -1140,14 +1274,14 @@
           </w:tcPr>
           <w:p>
             <w:pPr>
-              <w:spacing w:before="40" w:after="0" w:line="247" w:lineRule="auto"/>
+              <w:spacing w:before="24" w:after="0" w:line="245" w:lineRule="auto"/>
               <w:jc w:val="right"/>
             </w:pPr>
             <w:r>
               <w:rPr>
                 <w:rFonts w:ascii="Liberation Serif" w:hAnsi="Liberation Serif"/>
                 <w:b/>
-                <w:sz w:val="21"/>
+                <w:sz w:val="20"/>
               </w:rPr>
               <w:t>Bucharest, Romania</w:t>
             </w:r>
@@ -1157,7 +1291,7 @@
       <w:tr>
         <w:tc>
           <w:tcPr>
-            <w:tcW w:type="dxa" w:w="7560"/>
+            <w:tcW w:type="dxa" w:w="7632"/>
             <w:tcMar>
               <w:top w:w="0" w:type="dxa"/>
               <w:bottom w:w="0" w:type="dxa"/>
@@ -1167,13 +1301,13 @@
           </w:tcPr>
           <w:p>
             <w:pPr>
-              <w:spacing w:before="0" w:after="10" w:line="247" w:lineRule="auto"/>
+              <w:spacing w:before="0" w:after="10" w:line="245" w:lineRule="auto"/>
             </w:pPr>
             <w:r>
               <w:rPr>
                 <w:rFonts w:ascii="Liberation Serif" w:hAnsi="Liberation Serif"/>
                 <w:i/>
-                <w:sz w:val="20"/>
+                <w:sz w:val="19"/>
               </w:rPr>
               <w:t>Volunteer, Communications &amp; Finance Coordinator</w:t>
             </w:r>
@@ -1181,7 +1315,7 @@
         </w:tc>
         <w:tc>
           <w:tcPr>
-            <w:tcW w:type="dxa" w:w="2678"/>
+            <w:tcW w:type="dxa" w:w="2693"/>
             <w:tcMar>
               <w:top w:w="0" w:type="dxa"/>
               <w:bottom w:w="0" w:type="dxa"/>
@@ -1191,14 +1325,14 @@
           </w:tcPr>
           <w:p>
             <w:pPr>
-              <w:spacing w:before="0" w:after="10" w:line="247" w:lineRule="auto"/>
+              <w:spacing w:before="0" w:after="10" w:line="245" w:lineRule="auto"/>
               <w:jc w:val="right"/>
             </w:pPr>
             <w:r>
               <w:rPr>
                 <w:rFonts w:ascii="Liberation Serif" w:hAnsi="Liberation Serif"/>
                 <w:i w:val="0"/>
-                <w:sz w:val="20"/>
+                <w:sz w:val="19"/>
               </w:rPr>
               <w:t>2022 - 2024</w:t>
             </w:r>
@@ -1208,73 +1342,73 @@
     </w:tbl>
     <w:p>
       <w:pPr>
-        <w:spacing w:before="0" w:after="20" w:line="250" w:lineRule="auto"/>
+        <w:spacing w:before="0" w:after="12" w:line="245" w:lineRule="auto"/>
         <w:ind w:left="346" w:hanging="202"/>
       </w:pPr>
       <w:r>
         <w:rPr>
           <w:rFonts w:ascii="Liberation Serif" w:hAnsi="Liberation Serif"/>
-          <w:sz w:val="20"/>
+          <w:sz w:val="19"/>
         </w:rPr>
         <w:t xml:space="preserve">• </w:t>
       </w:r>
       <w:r>
         <w:rPr>
           <w:rFonts w:ascii="Liberation Serif" w:hAnsi="Liberation Serif"/>
-          <w:sz w:val="20"/>
+          <w:sz w:val="19"/>
         </w:rPr>
         <w:t>Volunteered at one fair; coordinated communications and sponsorship outreach for 4+ months the following year; managed budgeting and financial administration during a subsequent 4+ month cycle</w:t>
       </w:r>
     </w:p>
     <w:p>
       <w:pPr>
-        <w:spacing w:before="50" w:after="10" w:line="247" w:lineRule="auto"/>
+        <w:spacing w:before="40" w:after="10" w:line="245" w:lineRule="auto"/>
       </w:pPr>
       <w:r>
         <w:rPr>
           <w:rFonts w:ascii="Liberation Serif" w:hAnsi="Liberation Serif"/>
           <w:b/>
-          <w:sz w:val="20"/>
+          <w:sz w:val="19"/>
         </w:rPr>
         <w:t>Additional Activities</w:t>
       </w:r>
     </w:p>
     <w:p>
       <w:pPr>
-        <w:spacing w:before="0" w:after="20" w:line="250" w:lineRule="auto"/>
+        <w:spacing w:before="0" w:after="12" w:line="245" w:lineRule="auto"/>
         <w:ind w:left="346" w:hanging="202"/>
       </w:pPr>
       <w:r>
         <w:rPr>
           <w:rFonts w:ascii="Liberation Serif" w:hAnsi="Liberation Serif"/>
-          <w:sz w:val="20"/>
+          <w:sz w:val="19"/>
         </w:rPr>
         <w:t xml:space="preserve">• </w:t>
       </w:r>
       <w:r>
         <w:rPr>
           <w:rFonts w:ascii="Liberation Serif" w:hAnsi="Liberation Serif"/>
-          <w:sz w:val="20"/>
+          <w:sz w:val="19"/>
         </w:rPr>
         <w:t>Executive production for TEDx Avenor (2023); sponsorship team member for a 24-hour business challenge</w:t>
       </w:r>
     </w:p>
     <w:p>
       <w:pPr>
-        <w:spacing w:before="0" w:after="20" w:line="250" w:lineRule="auto"/>
+        <w:spacing w:before="0" w:after="12" w:line="245" w:lineRule="auto"/>
         <w:ind w:left="346" w:hanging="202"/>
       </w:pPr>
       <w:r>
         <w:rPr>
           <w:rFonts w:ascii="Liberation Serif" w:hAnsi="Liberation Serif"/>
-          <w:sz w:val="20"/>
+          <w:sz w:val="19"/>
         </w:rPr>
         <w:t xml:space="preserve">• </w:t>
       </w:r>
       <w:r>
         <w:rPr>
           <w:rFonts w:ascii="Liberation Serif" w:hAnsi="Liberation Serif"/>
-          <w:sz w:val="20"/>
+          <w:sz w:val="19"/>
         </w:rPr>
         <w:t>Community initiatives: Baneasa Forest campaign (2023-2024), Avenor Forest Run (2022), Time to Play NGO mobility project (2025)</w:t>
       </w:r>
@@ -1282,13 +1416,13 @@
     <w:p>
       <w:pPr>
         <w:keepNext/>
-        <w:spacing w:before="130" w:after="40" w:line="240" w:lineRule="auto"/>
+        <w:spacing w:before="90" w:after="30" w:line="240" w:lineRule="auto"/>
       </w:pPr>
       <w:r>
         <w:rPr>
           <w:rFonts w:ascii="Liberation Serif" w:hAnsi="Liberation Serif"/>
           <w:b/>
-          <w:sz w:val="21"/>
+          <w:sz w:val="20"/>
           <w:u w:val="single"/>
         </w:rPr>
         <w:t>AUTHORED WORKS</w:t>
@@ -1296,40 +1430,40 @@
     </w:p>
     <w:p>
       <w:pPr>
-        <w:spacing w:before="0" w:after="20" w:line="250" w:lineRule="auto"/>
+        <w:spacing w:before="0" w:after="12" w:line="245" w:lineRule="auto"/>
         <w:ind w:left="346" w:hanging="202"/>
       </w:pPr>
       <w:r>
         <w:rPr>
           <w:rFonts w:ascii="Liberation Serif" w:hAnsi="Liberation Serif"/>
-          <w:sz w:val="20"/>
+          <w:sz w:val="19"/>
         </w:rPr>
         <w:t xml:space="preserve">• </w:t>
       </w:r>
       <w:r>
         <w:rPr>
           <w:rFonts w:ascii="Liberation Serif" w:hAnsi="Liberation Serif"/>
-          <w:sz w:val="20"/>
+          <w:sz w:val="19"/>
         </w:rPr>
         <w:t>An Investigation into Existing and Potential Economic Impacts of Internet Restrictions (EPQ)</w:t>
       </w:r>
     </w:p>
     <w:p>
       <w:pPr>
-        <w:spacing w:before="0" w:after="20" w:line="250" w:lineRule="auto"/>
+        <w:spacing w:before="0" w:after="12" w:line="245" w:lineRule="auto"/>
         <w:ind w:left="346" w:hanging="202"/>
       </w:pPr>
       <w:r>
         <w:rPr>
           <w:rFonts w:ascii="Liberation Serif" w:hAnsi="Liberation Serif"/>
-          <w:sz w:val="20"/>
+          <w:sz w:val="19"/>
         </w:rPr>
         <w:t xml:space="preserve">• </w:t>
       </w:r>
       <w:r>
         <w:rPr>
           <w:rFonts w:ascii="Liberation Serif" w:hAnsi="Liberation Serif"/>
-          <w:sz w:val="20"/>
+          <w:sz w:val="19"/>
         </w:rPr>
         <w:t>To What Extent Can Playing an Educational Game Help People Struggling with Dyslexia? (.XIA Software Project)</w:t>
       </w:r>
@@ -1337,13 +1471,13 @@
     <w:p>
       <w:pPr>
         <w:keepNext/>
-        <w:spacing w:before="130" w:after="40" w:line="240" w:lineRule="auto"/>
+        <w:spacing w:before="90" w:after="30" w:line="240" w:lineRule="auto"/>
       </w:pPr>
       <w:r>
         <w:rPr>
           <w:rFonts w:ascii="Liberation Serif" w:hAnsi="Liberation Serif"/>
           <w:b/>
-          <w:sz w:val="21"/>
+          <w:sz w:val="20"/>
           <w:u w:val="single"/>
         </w:rPr>
         <w:t>SKILLS &amp; INTERESTS</w:t>
@@ -1351,67 +1485,67 @@
     </w:p>
     <w:p>
       <w:pPr>
-        <w:spacing w:before="0" w:after="30" w:line="250" w:lineRule="auto"/>
+        <w:spacing w:before="0" w:after="20" w:line="245" w:lineRule="auto"/>
       </w:pPr>
       <w:r>
         <w:rPr>
           <w:rFonts w:ascii="Liberation Serif" w:hAnsi="Liberation Serif"/>
           <w:i/>
-          <w:sz w:val="20"/>
+          <w:sz w:val="19"/>
         </w:rPr>
         <w:t xml:space="preserve">Languages: </w:t>
       </w:r>
       <w:r>
         <w:rPr>
           <w:rFonts w:ascii="Liberation Serif" w:hAnsi="Liberation Serif"/>
-          <w:sz w:val="20"/>
+          <w:sz w:val="19"/>
         </w:rPr>
         <w:t>Romanian (Native), English (Fluent; IELTS 8.5), Spanish (DELE B1), Portuguese (Intermediate), Italian (Basic)</w:t>
       </w:r>
     </w:p>
     <w:p>
       <w:pPr>
-        <w:spacing w:before="0" w:after="30" w:line="250" w:lineRule="auto"/>
+        <w:spacing w:before="0" w:after="20" w:line="245" w:lineRule="auto"/>
       </w:pPr>
       <w:r>
         <w:rPr>
           <w:rFonts w:ascii="Liberation Serif" w:hAnsi="Liberation Serif"/>
           <w:i/>
-          <w:sz w:val="20"/>
+          <w:sz w:val="19"/>
         </w:rPr>
         <w:t xml:space="preserve">Technical Skills: </w:t>
       </w:r>
       <w:r>
         <w:rPr>
           <w:rFonts w:ascii="Liberation Serif" w:hAnsi="Liberation Serif"/>
-          <w:sz w:val="20"/>
+          <w:sz w:val="19"/>
         </w:rPr>
         <w:t>Python, TypeScript, Next.js, React, WebGPU, MediaPipe, Git, HTML/CSS, Excel, PowerPoint</w:t>
       </w:r>
     </w:p>
     <w:p>
       <w:pPr>
-        <w:spacing w:before="0" w:after="30" w:line="250" w:lineRule="auto"/>
+        <w:spacing w:before="0" w:after="20" w:line="245" w:lineRule="auto"/>
       </w:pPr>
       <w:r>
         <w:rPr>
           <w:rFonts w:ascii="Liberation Serif" w:hAnsi="Liberation Serif"/>
           <w:i/>
-          <w:sz w:val="20"/>
+          <w:sz w:val="19"/>
         </w:rPr>
         <w:t xml:space="preserve">Interests: </w:t>
       </w:r>
       <w:r>
         <w:rPr>
           <w:rFonts w:ascii="Liberation Serif" w:hAnsi="Liberation Serif"/>
-          <w:sz w:val="20"/>
+          <w:sz w:val="19"/>
         </w:rPr>
         <w:t>Table football, table tennis, custom PC building, open-source OS, European history</w:t>
       </w:r>
     </w:p>
     <w:sectPr>
       <w:pgSz w:w="11909" w:h="16834"/>
-      <w:pgMar w:top="749" w:right="835" w:bottom="691" w:left="835" w:header="720" w:footer="720" w:gutter="0"/>
+      <w:pgMar w:top="605" w:right="792" w:bottom="547" w:left="792" w:header="720" w:footer="720" w:gutter="0"/>
       <w:cols w:space="720"/>
       <w:docGrid w:linePitch="360"/>
     </w:sectPr>
@@ -1785,7 +1919,7 @@
     <w:rPr>
       <w:rFonts w:ascii="Liberation Serif" w:hAnsi="Liberation Serif"/>
       <w:color w:val="000000"/>
-      <w:sz w:val="21"/>
+      <w:sz w:val="20"/>
     </w:rPr>
   </w:style>
   <w:style w:type="paragraph" w:styleId="Header">

</xml_diff>